<commit_message>
Update Word documents: set text alignment to Left for both architecture and installation guide
</commit_message>
<xml_diff>
--- a/HUONG_DAN_CAI_DAT_VA_KHOI_CHAY.docx
+++ b/HUONG_DAN_CAI_DAT_VA_KHOI_CHAY.docx
@@ -70,7 +70,7 @@
     </w:p>
     <w:p>
       <w:pPr>
-        <w:jc w:val="both"/>
+        <w:jc w:val="left"/>
       </w:pPr>
       <w:r>
         <w:t>Để đảm bảo việc cài đặt và khởi chạy ứng dụng thành công trên máy cục bộ (Local Development) hoặc máy chủ thử nghiệm, máy tính phát triển cần đáp ứng các thông số môi trường dưới đây:</w:t>
@@ -456,7 +456,7 @@
     </w:p>
     <w:p>
       <w:pPr>
-        <w:jc w:val="both"/>
+        <w:jc w:val="left"/>
       </w:pPr>
       <w:r>
         <w:t>Mở cửa sổ Command Prompt / Terminal tại thư mục làm việc và thực hiện lệnh clone mã nguồn dự án:</w:t>
@@ -483,7 +483,7 @@
     </w:p>
     <w:p>
       <w:pPr>
-        <w:jc w:val="both"/>
+        <w:jc w:val="left"/>
       </w:pPr>
       <w:r>
         <w:t>1. Di chuyển vào thư mục backend và cài đặt các thư viện phụ thuộc:</w:t>
@@ -493,7 +493,7 @@
         <w:t>npm install</w:t>
         <w:br/>
         <w:br/>
-        <w:t>2. Tạo tệp cấu hình môi trường `.env` tại thư mục `backend/` với nội dung mẫu sau:</w:t>
+        <w:t>2. Tạo tệp cấu hình môi trường .env tại thư mục backend/ với nội dung mẫu sau:</w:t>
         <w:br/>
         <w:t>PORT=5000</w:t>
         <w:br/>
@@ -524,10 +524,10 @@
     </w:p>
     <w:p>
       <w:pPr>
-        <w:jc w:val="both"/>
+        <w:jc w:val="left"/>
       </w:pPr>
       <w:r>
-        <w:t>Để tạo sẵn kho đề thi IELTS Cambridge, danh sách bài giảng lý thuyết, bộ câu hỏi bài tập tương tác và tài khoản thử nghiệm, chạy tập tin seeder tại thư mục `backend/`:</w:t>
+        <w:t>Để tạo sẵn kho đề thi IELTS Cambridge, danh sách bài giảng lý thuyết, bộ câu hỏi bài tập tương tác và tài khoản thử nghiệm, chạy tập tin seeder tại thư mục backend/:</w:t>
         <w:br/>
         <w:t>npm run seed</w:t>
         <w:br/>
@@ -556,10 +556,10 @@
     </w:p>
     <w:p>
       <w:pPr>
-        <w:jc w:val="both"/>
+        <w:jc w:val="left"/>
       </w:pPr>
       <w:r>
-        <w:t>Mở một cửa sổ Terminal mới, di chuyển tới thư mục `frontend/` và tiến hành cài đặt thư viện:</w:t>
+        <w:t>Mở một cửa sổ Terminal mới, di chuyển tới thư mục frontend/ và tiến hành cài đặt thư viện:</w:t>
         <w:br/>
         <w:t>cd frontend</w:t>
         <w:br/>
@@ -599,10 +599,10 @@
     </w:p>
     <w:p>
       <w:pPr>
-        <w:jc w:val="both"/>
+        <w:jc w:val="left"/>
       </w:pPr>
       <w:r>
-        <w:t>Tại thư mục `backend/`, chạy lệnh khởi động máy chủ API Server:</w:t>
+        <w:t>Tại thư mục backend/, chạy lệnh khởi động máy chủ API Server:</w:t>
         <w:br/>
         <w:t>npm start</w:t>
         <w:br/>
@@ -626,10 +626,10 @@
     </w:p>
     <w:p>
       <w:pPr>
-        <w:jc w:val="both"/>
+        <w:jc w:val="left"/>
       </w:pPr>
       <w:r>
-        <w:t>Tại thư mục `frontend/`, chạy lệnh khởi động máy chủ phát triển Vite Dev Server:</w:t>
+        <w:t>Tại thư mục frontend/, chạy lệnh khởi động máy chủ phát triển Vite Dev Server:</w:t>
         <w:br/>
         <w:t>npm run dev</w:t>
         <w:br/>
@@ -653,10 +653,10 @@
     </w:p>
     <w:p>
       <w:pPr>
-        <w:jc w:val="both"/>
+        <w:jc w:val="left"/>
       </w:pPr>
       <w:r>
-        <w:t>Hệ thống đi kèm bộ kiểm thử tự động gồm 8 Phase bao phủ toàn bộ chức năng cốt lõi (Auth, Placement, Task 2 Adaptive, AI Grading, Level Migration, Admin Rubric Manager). Chạy lệnh tại thư mục `backend/`:</w:t>
+        <w:t>Hệ thống đi kèm bộ kiểm thử tự động gồm 8 Phase bao phủ toàn bộ chức năng cốt lõi (Auth, Placement, Task 2 Adaptive, AI Grading, Level Migration, Admin Rubric Manager). Chạy lệnh tại thư mục backend/:</w:t>
         <w:br/>
         <w:t>node test/runSystemTests.js</w:t>
         <w:br/>

</xml_diff>

<commit_message>
Docs: update HUONG_DAN_CAI_DAT_VA_KHOI_CHAY.docx to align with admin-only login hint UI
</commit_message>
<xml_diff>
--- a/HUONG_DAN_CAI_DAT_VA_KHOI_CHAY.docx
+++ b/HUONG_DAN_CAI_DAT_VA_KHOI_CHAY.docx
@@ -532,11 +532,11 @@
         <w:t>npm run seed</w:t>
         <w:br/>
         <w:br/>
-        <w:t>Tài khoản truy cập mặc định được khởi tạo tự động:</w:t>
+        <w:t>Tài khoản truy cập mặc định được khởi tạo tự động (gợi ý sẵn trên giao diện Đăng Nhập):</w:t>
+        <w:br/>
+        <w:t>- Tài khoản Quản trị (Admin): Email: admin@gft.edu.vn | Mật khẩu: 123456 (Quyền Quản trị viên tối cao)</w:t>
         <w:br/>
         <w:t>- Tài khoản Học viên (Student): Email: student@gft.edu.vn | Mật khẩu: 123456 (Thuộc nhóm Cần Hỗ Trợ - support)</w:t>
-        <w:br/>
-        <w:t>- Tài khoản Quản trị (Admin): Email: admin@gft.edu.vn | Mật khẩu: 123456 (Quyền Quản trị viên)</w:t>
       </w:r>
     </w:p>
     <w:p>

</xml_diff>